<commit_message>
add documentation for movement and sensor data tracking features
</commit_message>
<xml_diff>
--- a/konkretisierung.docx
+++ b/konkretisierung.docx
@@ -33,26 +33,46 @@
     <w:p/>
     <w:p>
       <w:r>
+        <w:rPr>
+          <w:highlight w:val="green"/>
+        </w:rPr>
         <w:t>Meiste Schritte -&gt; Pedometer</w:t>
       </w:r>
     </w:p>
     <w:p>
       <w:r>
+        <w:rPr>
+          <w:highlight w:val="green"/>
+        </w:rPr>
         <w:t>Am meisten Strecke zurückgelegt -&gt; GPS-Sensor</w:t>
       </w:r>
     </w:p>
     <w:p>
-      <w:r>
+      <w:pPr>
+        <w:rPr>
+          <w:lang w:val="de-DE"/>
+        </w:rPr>
+      </w:pPr>
+      <w:r>
+        <w:rPr>
+          <w:highlight w:val="green"/>
+        </w:rPr>
         <w:t>Am meisten Höhe zurückgelegt -&gt; Barometer</w:t>
       </w:r>
     </w:p>
     <w:p>
       <w:r>
+        <w:rPr>
+          <w:highlight w:val="green"/>
+        </w:rPr>
         <w:t>Höchster Punkt erreicht -&gt; Barometer</w:t>
       </w:r>
     </w:p>
     <w:p>
       <w:r>
+        <w:rPr>
+          <w:highlight w:val="green"/>
+        </w:rPr>
         <w:t>Kaffee-Pause -&gt; Beschleunigungssensor/GPS</w:t>
       </w:r>
     </w:p>
@@ -69,8 +89,14 @@
           <w:ilvl w:val="0"/>
           <w:numId w:val="1"/>
         </w:numPr>
-      </w:pPr>
-      <w:r>
+        <w:rPr>
+          <w:highlight w:val="green"/>
+        </w:rPr>
+      </w:pPr>
+      <w:r>
+        <w:rPr>
+          <w:highlight w:val="green"/>
+        </w:rPr>
         <w:t>Multi-User</w:t>
       </w:r>
     </w:p>
@@ -81,8 +107,14 @@
           <w:ilvl w:val="0"/>
           <w:numId w:val="1"/>
         </w:numPr>
-      </w:pPr>
-      <w:r>
+        <w:rPr>
+          <w:highlight w:val="yellow"/>
+        </w:rPr>
+      </w:pPr>
+      <w:r>
+        <w:rPr>
+          <w:highlight w:val="yellow"/>
+        </w:rPr>
         <w:t>Kompass/Kategorie</w:t>
       </w:r>
     </w:p>
@@ -93,9 +125,15 @@
           <w:ilvl w:val="0"/>
           <w:numId w:val="1"/>
         </w:numPr>
+        <w:rPr>
+          <w:highlight w:val="yellow"/>
+        </w:rPr>
       </w:pPr>
       <w:proofErr w:type="spellStart"/>
       <w:r>
+        <w:rPr>
+          <w:highlight w:val="yellow"/>
+        </w:rPr>
         <w:t>Leaderboard</w:t>
       </w:r>
       <w:proofErr w:type="spellEnd"/>
@@ -107,8 +145,14 @@
           <w:ilvl w:val="0"/>
           <w:numId w:val="1"/>
         </w:numPr>
-      </w:pPr>
-      <w:r>
+        <w:rPr>
+          <w:highlight w:val="green"/>
+        </w:rPr>
+      </w:pPr>
+      <w:r>
+        <w:rPr>
+          <w:highlight w:val="green"/>
+        </w:rPr>
         <w:t>Push-Benachrichtigungen</w:t>
       </w:r>
     </w:p>
@@ -299,7 +343,6 @@
           <w:b/>
           <w:bCs/>
         </w:rPr>
-        <w:lastRenderedPageBreak/>
         <w:t>Handy-Flip-Challenge</w:t>
       </w:r>
     </w:p>
@@ -1856,6 +1899,7 @@
   <w:style w:type="character" w:default="1" w:styleId="Absatz-Standardschriftart">
     <w:name w:val="Default Paragraph Font"/>
     <w:uiPriority w:val="1"/>
+    <w:semiHidden/>
     <w:unhideWhenUsed/>
   </w:style>
   <w:style w:type="table" w:default="1" w:styleId="NormaleTabelle">

</xml_diff>